<commit_message>
feat: add research plan endpoints and frontend integration
- Implemented backend controllers for fetching full research plans and plans by department.
- Created routes for the new plan endpoints.
- Developed a service to manage department-specific research plans.
- Added a custom hook in the frontend to fetch plans based on department ID.
- Created a PlanPicker component to allow users to select axes and goals from the research plan.
- Integrated translations for user-facing messages related to the research plan.
</commit_message>
<xml_diff>
--- a/backend/scripts/supervisor-request-empty.docx
+++ b/backend/scripts/supervisor-request-empty.docx
@@ -376,6 +376,142 @@
           <w:p>
             <w:pPr>
               <w:pStyle w:val="Normal"/>
+              <w:rPr/>
+            </w:pPr>
+            <w:r>
+              <w:rPr>
+                <w:rtl w:val="true"/>
+              </w:rPr>
+            </w:r>
+          </w:p>
+        </w:tc>
+      </w:tr>
+    </w:tbl>
+    <w:p>
+      <w:pPr>
+        <w:pStyle w:val="Normal"/>
+        <w:bidi w:val="1"/>
+        <w:jc w:val="left"/>
+        <w:rPr>
+          <w:rFonts w:ascii="Simplified Arabic" w:hAnsi="Simplified Arabic" w:cs="Simplified Arabic"/>
+          <w:sz w:val="10"/>
+          <w:szCs w:val="10"/>
+          <w:lang w:bidi="ar-EG"/>
+        </w:rPr>
+      </w:pPr>
+      <w:r>
+        <w:rPr>
+          <w:rFonts w:cs="Simplified Arabic" w:ascii="Simplified Arabic" w:hAnsi="Simplified Arabic"/>
+          <w:sz w:val="10"/>
+          <w:szCs w:val="10"/>
+          <w:rtl w:val="true"/>
+          <w:lang w:bidi="ar-EG"/>
+        </w:rPr>
+      </w:r>
+    </w:p>
+    <w:tbl>
+      <w:tblPr>
+        <w:bidiVisual w:val="true"/>
+        <w:tblW w:w="9897" w:type="dxa"/>
+        <w:jc w:val="left"/>
+        <w:tblInd w:w="-597" w:type="dxa"/>
+        <w:tblLayout w:type="fixed"/>
+        <w:tblCellMar>
+          <w:top w:w="0" w:type="dxa"/>
+          <w:left w:w="108" w:type="dxa"/>
+          <w:bottom w:w="0" w:type="dxa"/>
+          <w:right w:w="108" w:type="dxa"/>
+        </w:tblCellMar>
+        <w:tblLook w:noHBand="0" w:noVBand="1" w:firstColumn="1" w:lastRow="0" w:lastColumn="0" w:firstRow="1" w:val="04a0"/>
+      </w:tblPr>
+      <w:tblGrid>
+        <w:gridCol w:w="2517"/>
+        <w:gridCol w:w="7380"/>
+      </w:tblGrid>
+      <w:tr>
+        <w:trPr>
+          <w:trHeight w:val="249" w:hRule="atLeast"/>
+        </w:trPr>
+        <w:tc>
+          <w:tcPr>
+            <w:tcW w:w="2517" w:type="dxa"/>
+            <w:tcBorders>
+              <w:right w:val="single" w:sz="4" w:space="0" w:color="000000"/>
+            </w:tcBorders>
+          </w:tcPr>
+          <w:p>
+            <w:pPr>
+              <w:pStyle w:val="Normal"/>
+              <w:bidi w:val="1"/>
+              <w:ind w:right="-709"/>
+              <w:jc w:val="left"/>
+              <w:rPr/>
+            </w:pPr>
+            <w:r>
+              <w:rPr>
+                <w:rFonts w:ascii="Simplified Arabic" w:hAnsi="Simplified Arabic" w:cs="Simplified Arabic"/>
+                <w:b/>
+                <w:b/>
+                <w:bCs/>
+                <w:sz w:val="26"/>
+                <w:szCs w:val="26"/>
+                <w:rtl w:val="true"/>
+                <w:lang w:bidi="ar-EG"/>
+              </w:rPr>
+              <w:t xml:space="preserve">الرقم القومي </w:t>
+            </w:r>
+            <w:r>
+              <w:rPr>
+                <w:rFonts w:cs="Simplified Arabic" w:ascii="Simplified Arabic" w:hAnsi="Simplified Arabic"/>
+                <w:b/>
+                <w:bCs/>
+                <w:sz w:val="26"/>
+                <w:szCs w:val="26"/>
+                <w:rtl w:val="true"/>
+                <w:lang w:bidi="ar-EG"/>
+              </w:rPr>
+              <w:t xml:space="preserve">/ </w:t>
+            </w:r>
+            <w:r>
+              <w:rPr>
+                <w:rFonts w:ascii="Simplified Arabic" w:hAnsi="Simplified Arabic" w:cs="Simplified Arabic"/>
+                <w:b/>
+                <w:b/>
+                <w:bCs/>
+                <w:sz w:val="26"/>
+                <w:szCs w:val="26"/>
+                <w:rtl w:val="true"/>
+                <w:lang w:bidi="ar-EG"/>
+              </w:rPr>
+              <w:t>جواز السفر</w:t>
+            </w:r>
+            <w:r>
+              <w:rPr>
+                <w:rFonts w:cs="Simplified Arabic" w:ascii="Simplified Arabic" w:hAnsi="Simplified Arabic"/>
+                <w:b/>
+                <w:bCs/>
+                <w:sz w:val="26"/>
+                <w:szCs w:val="26"/>
+                <w:rtl w:val="true"/>
+                <w:lang w:bidi="ar-EG"/>
+              </w:rPr>
+              <w:t>:</w:t>
+            </w:r>
+          </w:p>
+        </w:tc>
+        <w:tc>
+          <w:tcPr>
+            <w:tcW w:w="7380" w:type="dxa"/>
+            <w:tcBorders>
+              <w:top w:val="single" w:sz="4" w:space="0" w:color="000000"/>
+              <w:left w:val="single" w:sz="4" w:space="0" w:color="000000"/>
+              <w:bottom w:val="single" w:sz="4" w:space="0" w:color="000000"/>
+              <w:right w:val="single" w:sz="4" w:space="0" w:color="000000"/>
+            </w:tcBorders>
+          </w:tcPr>
+          <w:p>
+            <w:pPr>
+              <w:pStyle w:val="Normal"/>
               <w:bidi w:val="1"/>
               <w:ind w:right="-709"/>
               <w:jc w:val="left"/>
@@ -438,11 +574,11 @@
       </w:tblPr>
       <w:tblGrid>
         <w:gridCol w:w="1345"/>
-        <w:gridCol w:w="1744"/>
+        <w:gridCol w:w="1743"/>
         <w:gridCol w:w="2513"/>
-        <w:gridCol w:w="633"/>
-        <w:gridCol w:w="2157"/>
-        <w:gridCol w:w="1505"/>
+        <w:gridCol w:w="634"/>
+        <w:gridCol w:w="2156"/>
+        <w:gridCol w:w="1506"/>
       </w:tblGrid>
       <w:tr>
         <w:trPr>
@@ -492,7 +628,7 @@
         </w:tc>
         <w:tc>
           <w:tcPr>
-            <w:tcW w:w="1744" w:type="dxa"/>
+            <w:tcW w:w="1743" w:type="dxa"/>
             <w:tcBorders>
               <w:top w:val="single" w:sz="4" w:space="0" w:color="000000"/>
               <w:left w:val="single" w:sz="4" w:space="0" w:color="000000"/>
@@ -585,7 +721,7 @@
         </w:tc>
         <w:tc>
           <w:tcPr>
-            <w:tcW w:w="633" w:type="dxa"/>
+            <w:tcW w:w="634" w:type="dxa"/>
             <w:tcBorders>
               <w:top w:val="single" w:sz="4" w:space="0" w:color="000000"/>
               <w:left w:val="single" w:sz="4" w:space="0" w:color="000000"/>
@@ -623,7 +759,7 @@
         </w:tc>
         <w:tc>
           <w:tcPr>
-            <w:tcW w:w="2157" w:type="dxa"/>
+            <w:tcW w:w="2156" w:type="dxa"/>
             <w:tcBorders>
               <w:left w:val="single" w:sz="4" w:space="0" w:color="000000"/>
               <w:right w:val="single" w:sz="4" w:space="0" w:color="000000"/>
@@ -713,7 +849,7 @@
         </w:tc>
         <w:tc>
           <w:tcPr>
-            <w:tcW w:w="1505" w:type="dxa"/>
+            <w:tcW w:w="1506" w:type="dxa"/>
             <w:tcBorders>
               <w:top w:val="single" w:sz="4" w:space="0" w:color="000000"/>
               <w:left w:val="single" w:sz="4" w:space="0" w:color="000000"/>
@@ -792,11 +928,11 @@
         <w:tblLook w:noHBand="0" w:noVBand="1" w:firstColumn="1" w:lastRow="0" w:lastColumn="0" w:firstRow="1" w:val="04a0"/>
       </w:tblPr>
       <w:tblGrid>
-        <w:gridCol w:w="112"/>
-        <w:gridCol w:w="1562"/>
-        <w:gridCol w:w="3194"/>
+        <w:gridCol w:w="111"/>
+        <w:gridCol w:w="1563"/>
+        <w:gridCol w:w="3193"/>
         <w:gridCol w:w="347"/>
-        <w:gridCol w:w="2057"/>
+        <w:gridCol w:w="2058"/>
         <w:gridCol w:w="2625"/>
         <w:gridCol w:w="11"/>
       </w:tblGrid>
@@ -847,7 +983,7 @@
         </w:tc>
         <w:tc>
           <w:tcPr>
-            <w:tcW w:w="3194" w:type="dxa"/>
+            <w:tcW w:w="3193" w:type="dxa"/>
             <w:tcBorders/>
           </w:tcPr>
           <w:p>
@@ -876,7 +1012,7 @@
         </w:tc>
         <w:tc>
           <w:tcPr>
-            <w:tcW w:w="2404" w:type="dxa"/>
+            <w:tcW w:w="2405" w:type="dxa"/>
             <w:gridSpan w:val="2"/>
             <w:tcBorders/>
           </w:tcPr>
@@ -932,7 +1068,7 @@
         </w:trPr>
         <w:tc>
           <w:tcPr>
-            <w:tcW w:w="112" w:type="dxa"/>
+            <w:tcW w:w="111" w:type="dxa"/>
             <w:tcBorders/>
           </w:tcPr>
           <w:p>
@@ -1026,7 +1162,7 @@
         </w:tc>
         <w:tc>
           <w:tcPr>
-            <w:tcW w:w="4682" w:type="dxa"/>
+            <w:tcW w:w="4683" w:type="dxa"/>
             <w:gridSpan w:val="2"/>
             <w:tcBorders>
               <w:top w:val="single" w:sz="4" w:space="0" w:color="000000"/>
@@ -1115,7 +1251,7 @@
         </w:trPr>
         <w:tc>
           <w:tcPr>
-            <w:tcW w:w="112" w:type="dxa"/>
+            <w:tcW w:w="111" w:type="dxa"/>
             <w:tcBorders/>
           </w:tcPr>
           <w:p>
@@ -1182,7 +1318,7 @@
         </w:tc>
         <w:tc>
           <w:tcPr>
-            <w:tcW w:w="4682" w:type="dxa"/>
+            <w:tcW w:w="4683" w:type="dxa"/>
             <w:gridSpan w:val="2"/>
             <w:tcBorders>
               <w:top w:val="single" w:sz="4" w:space="0" w:color="000000"/>
@@ -1248,7 +1384,7 @@
         </w:trPr>
         <w:tc>
           <w:tcPr>
-            <w:tcW w:w="112" w:type="dxa"/>
+            <w:tcW w:w="111" w:type="dxa"/>
             <w:tcBorders/>
           </w:tcPr>
           <w:p>
@@ -1315,7 +1451,7 @@
         </w:tc>
         <w:tc>
           <w:tcPr>
-            <w:tcW w:w="4682" w:type="dxa"/>
+            <w:tcW w:w="4683" w:type="dxa"/>
             <w:gridSpan w:val="2"/>
             <w:tcBorders>
               <w:top w:val="single" w:sz="4" w:space="0" w:color="000000"/>
@@ -1381,7 +1517,7 @@
         </w:trPr>
         <w:tc>
           <w:tcPr>
-            <w:tcW w:w="112" w:type="dxa"/>
+            <w:tcW w:w="111" w:type="dxa"/>
             <w:tcBorders/>
           </w:tcPr>
           <w:p>
@@ -1448,7 +1584,7 @@
         </w:tc>
         <w:tc>
           <w:tcPr>
-            <w:tcW w:w="4682" w:type="dxa"/>
+            <w:tcW w:w="4683" w:type="dxa"/>
             <w:gridSpan w:val="2"/>
             <w:tcBorders>
               <w:top w:val="single" w:sz="4" w:space="0" w:color="000000"/>
@@ -1514,7 +1650,7 @@
         </w:trPr>
         <w:tc>
           <w:tcPr>
-            <w:tcW w:w="112" w:type="dxa"/>
+            <w:tcW w:w="111" w:type="dxa"/>
             <w:tcBorders/>
           </w:tcPr>
           <w:p>
@@ -1581,7 +1717,7 @@
         </w:tc>
         <w:tc>
           <w:tcPr>
-            <w:tcW w:w="4682" w:type="dxa"/>
+            <w:tcW w:w="4683" w:type="dxa"/>
             <w:gridSpan w:val="2"/>
             <w:tcBorders>
               <w:top w:val="single" w:sz="4" w:space="0" w:color="000000"/>
@@ -1873,10 +2009,10 @@
       </w:tblPr>
       <w:tblGrid>
         <w:gridCol w:w="1816"/>
-        <w:gridCol w:w="1556"/>
-        <w:gridCol w:w="1780"/>
-        <w:gridCol w:w="1481"/>
-        <w:gridCol w:w="3264"/>
+        <w:gridCol w:w="1555"/>
+        <w:gridCol w:w="1781"/>
+        <w:gridCol w:w="1480"/>
+        <w:gridCol w:w="3265"/>
       </w:tblGrid>
       <w:tr>
         <w:trPr>
@@ -2116,7 +2252,7 @@
         </w:tc>
         <w:tc>
           <w:tcPr>
-            <w:tcW w:w="1556" w:type="dxa"/>
+            <w:tcW w:w="1555" w:type="dxa"/>
             <w:tcBorders>
               <w:top w:val="single" w:sz="4" w:space="0" w:color="000000"/>
               <w:left w:val="single" w:sz="4" w:space="0" w:color="000000"/>
@@ -2162,7 +2298,7 @@
         </w:tc>
         <w:tc>
           <w:tcPr>
-            <w:tcW w:w="1780" w:type="dxa"/>
+            <w:tcW w:w="1781" w:type="dxa"/>
             <w:tcBorders>
               <w:top w:val="single" w:sz="4" w:space="0" w:color="000000"/>
               <w:left w:val="single" w:sz="4" w:space="0" w:color="000000"/>
@@ -2208,7 +2344,7 @@
         </w:tc>
         <w:tc>
           <w:tcPr>
-            <w:tcW w:w="1481" w:type="dxa"/>
+            <w:tcW w:w="1480" w:type="dxa"/>
             <w:tcBorders>
               <w:top w:val="single" w:sz="4" w:space="0" w:color="000000"/>
               <w:left w:val="single" w:sz="4" w:space="0" w:color="000000"/>
@@ -2254,7 +2390,7 @@
         </w:tc>
         <w:tc>
           <w:tcPr>
-            <w:tcW w:w="3264" w:type="dxa"/>
+            <w:tcW w:w="3265" w:type="dxa"/>
             <w:tcBorders>
               <w:top w:val="single" w:sz="4" w:space="0" w:color="000000"/>
               <w:left w:val="single" w:sz="4" w:space="0" w:color="000000"/>
@@ -2338,7 +2474,7 @@
         </w:tc>
         <w:tc>
           <w:tcPr>
-            <w:tcW w:w="1556" w:type="dxa"/>
+            <w:tcW w:w="1555" w:type="dxa"/>
             <w:tcBorders>
               <w:top w:val="single" w:sz="4" w:space="0" w:color="000000"/>
               <w:left w:val="single" w:sz="4" w:space="0" w:color="000000"/>
@@ -2368,7 +2504,7 @@
         </w:tc>
         <w:tc>
           <w:tcPr>
-            <w:tcW w:w="1780" w:type="dxa"/>
+            <w:tcW w:w="1781" w:type="dxa"/>
             <w:tcBorders>
               <w:top w:val="single" w:sz="4" w:space="0" w:color="000000"/>
               <w:left w:val="single" w:sz="4" w:space="0" w:color="000000"/>
@@ -2402,7 +2538,7 @@
         </w:tc>
         <w:tc>
           <w:tcPr>
-            <w:tcW w:w="1481" w:type="dxa"/>
+            <w:tcW w:w="1480" w:type="dxa"/>
             <w:tcBorders>
               <w:top w:val="single" w:sz="4" w:space="0" w:color="000000"/>
               <w:left w:val="single" w:sz="4" w:space="0" w:color="000000"/>
@@ -2436,7 +2572,7 @@
         </w:tc>
         <w:tc>
           <w:tcPr>
-            <w:tcW w:w="3264" w:type="dxa"/>
+            <w:tcW w:w="3265" w:type="dxa"/>
             <w:tcBorders>
               <w:top w:val="single" w:sz="4" w:space="0" w:color="000000"/>
               <w:left w:val="single" w:sz="4" w:space="0" w:color="000000"/>
@@ -2520,8 +2656,8 @@
         <w:tblLook w:noHBand="0" w:noVBand="1" w:firstColumn="1" w:lastRow="0" w:lastColumn="0" w:firstRow="1" w:val="04a0"/>
       </w:tblPr>
       <w:tblGrid>
-        <w:gridCol w:w="3966"/>
-        <w:gridCol w:w="3122"/>
+        <w:gridCol w:w="3965"/>
+        <w:gridCol w:w="3123"/>
         <w:gridCol w:w="2694"/>
       </w:tblGrid>
       <w:tr>
@@ -2530,7 +2666,7 @@
         </w:trPr>
         <w:tc>
           <w:tcPr>
-            <w:tcW w:w="3966" w:type="dxa"/>
+            <w:tcW w:w="3965" w:type="dxa"/>
             <w:tcBorders>
               <w:top w:val="single" w:sz="4" w:space="0" w:color="000000"/>
               <w:left w:val="single" w:sz="4" w:space="0" w:color="000000"/>
@@ -2590,7 +2726,7 @@
         </w:tc>
         <w:tc>
           <w:tcPr>
-            <w:tcW w:w="3122" w:type="dxa"/>
+            <w:tcW w:w="3123" w:type="dxa"/>
             <w:tcBorders>
               <w:top w:val="single" w:sz="4" w:space="0" w:color="000000"/>
               <w:left w:val="single" w:sz="4" w:space="0" w:color="000000"/>
@@ -2749,7 +2885,7 @@
         </w:trPr>
         <w:tc>
           <w:tcPr>
-            <w:tcW w:w="3966" w:type="dxa"/>
+            <w:tcW w:w="3965" w:type="dxa"/>
             <w:tcBorders>
               <w:top w:val="single" w:sz="4" w:space="0" w:color="000000"/>
               <w:left w:val="single" w:sz="4" w:space="0" w:color="000000"/>
@@ -2784,7 +2920,7 @@
         </w:tc>
         <w:tc>
           <w:tcPr>
-            <w:tcW w:w="3122" w:type="dxa"/>
+            <w:tcW w:w="3123" w:type="dxa"/>
             <w:tcBorders>
               <w:top w:val="single" w:sz="4" w:space="0" w:color="000000"/>
               <w:left w:val="single" w:sz="4" w:space="0" w:color="000000"/>
@@ -2815,7 +2951,7 @@
                 <w:lang w:bidi="ar-EG"/>
               </w:rPr>
               <w:drawing>
-                <wp:anchor distT="0" distB="0" distL="0" distR="0" simplePos="0" relativeHeight="5" behindDoc="0" locked="0" layoutInCell="1" allowOverlap="1">
+                <wp:anchor distT="0" distB="0" distL="0" distR="0" simplePos="0" relativeHeight="7" behindDoc="0" locked="0" layoutInCell="1" allowOverlap="1">
                   <wp:simplePos x="0" y="0"/>
                   <wp:positionH relativeFrom="column">
                     <wp:posOffset>-356235</wp:posOffset>
@@ -2884,7 +3020,7 @@
             </w:pPr>
             <w:r>
               <w:drawing>
-                <wp:anchor distT="0" distB="0" distL="0" distR="0" simplePos="0" relativeHeight="6" behindDoc="0" locked="0" layoutInCell="1" allowOverlap="1">
+                <wp:anchor distT="0" distB="0" distL="0" distR="0" simplePos="0" relativeHeight="8" behindDoc="0" locked="0" layoutInCell="1" allowOverlap="1">
                   <wp:simplePos x="0" y="0"/>
                   <wp:positionH relativeFrom="column">
                     <wp:posOffset>440690</wp:posOffset>
@@ -2932,10 +3068,10 @@
               <mc:AlternateContent>
                 <mc:Choice Requires="wps">
                   <w:drawing>
-                    <wp:anchor distT="1905" distB="635" distL="1270" distR="1270" simplePos="0" relativeHeight="8" behindDoc="0" locked="0" layoutInCell="1" allowOverlap="1">
+                    <wp:anchor distT="1905" distB="635" distL="1270" distR="1270" simplePos="0" relativeHeight="10" behindDoc="0" locked="0" layoutInCell="1" allowOverlap="1">
                       <wp:simplePos x="0" y="0"/>
                       <wp:positionH relativeFrom="column">
-                        <wp:posOffset>-45979715</wp:posOffset>
+                        <wp:posOffset>-1385069620</wp:posOffset>
                       </wp:positionH>
                       <wp:positionV relativeFrom="paragraph">
                         <wp:posOffset>47625</wp:posOffset>
@@ -2982,7 +3118,7 @@
                 </mc:Choice>
                 <mc:Fallback>
                   <w:pict>
-                    <v:roundrect id="shape_0" fillcolor="white" stroked="t" o:allowincell="t" style="position:absolute;margin-left:-3620.45pt;margin-top:3.75pt;width:11.2pt;height:9.7pt;mso-wrap-style:none;v-text-anchor:middle">
+                    <v:roundrect id="shape_0" fillcolor="white" stroked="t" o:allowincell="t" style="position:absolute;margin-left:-109060.6pt;margin-top:3.75pt;width:11.2pt;height:9.7pt;mso-wrap-style:none;v-text-anchor:middle">
                       <v:fill o:detectmouseclick="t" type="solid" color2="black"/>
                       <v:stroke color="black" joinstyle="round" endcap="flat"/>
                       <w10:wrap type="none"/>
@@ -2993,10 +3129,10 @@
               <mc:AlternateContent>
                 <mc:Choice Requires="wps">
                   <w:drawing>
-                    <wp:anchor distT="635" distB="635" distL="635" distR="635" simplePos="0" relativeHeight="10" behindDoc="0" locked="0" layoutInCell="1" allowOverlap="1">
+                    <wp:anchor distT="635" distB="635" distL="635" distR="635" simplePos="0" relativeHeight="12" behindDoc="0" locked="0" layoutInCell="1" allowOverlap="1">
                       <wp:simplePos x="0" y="0"/>
                       <wp:positionH relativeFrom="column">
-                        <wp:posOffset>-96110425</wp:posOffset>
+                        <wp:posOffset>-2147483648</wp:posOffset>
                       </wp:positionH>
                       <wp:positionV relativeFrom="paragraph">
                         <wp:posOffset>268605</wp:posOffset>
@@ -3043,7 +3179,7 @@
                 </mc:Choice>
                 <mc:Fallback>
                   <w:pict>
-                    <v:roundrect id="shape_0" fillcolor="white" stroked="t" o:allowincell="t" style="position:absolute;margin-left:-7567.75pt;margin-top:21.15pt;width:16.1pt;height:13.25pt;mso-wrap-style:none;v-text-anchor:middle">
+                    <v:roundrect id="shape_0" fillcolor="white" stroked="t" o:allowincell="t" style="position:absolute;margin-left:-235222.3pt;margin-top:21.15pt;width:16.1pt;height:13.25pt;mso-wrap-style:none;v-text-anchor:middle">
                       <v:fill o:detectmouseclick="t" type="solid" color2="black"/>
                       <v:stroke color="black" joinstyle="round" endcap="flat"/>
                       <w10:wrap type="none"/>
@@ -3081,7 +3217,7 @@
         </w:trPr>
         <w:tc>
           <w:tcPr>
-            <w:tcW w:w="3966" w:type="dxa"/>
+            <w:tcW w:w="3965" w:type="dxa"/>
             <w:tcBorders>
               <w:top w:val="single" w:sz="4" w:space="0" w:color="000000"/>
               <w:left w:val="single" w:sz="4" w:space="0" w:color="000000"/>
@@ -3116,7 +3252,7 @@
         </w:tc>
         <w:tc>
           <w:tcPr>
-            <w:tcW w:w="3122" w:type="dxa"/>
+            <w:tcW w:w="3123" w:type="dxa"/>
             <w:tcBorders>
               <w:top w:val="single" w:sz="4" w:space="0" w:color="000000"/>
               <w:left w:val="single" w:sz="4" w:space="0" w:color="000000"/>
@@ -3172,7 +3308,7 @@
               <mc:AlternateContent>
                 <mc:Choice Requires="wps">
                   <w:drawing>
-                    <wp:anchor distT="635" distB="635" distL="635" distR="635" simplePos="0" relativeHeight="4" behindDoc="1" locked="0" layoutInCell="1" allowOverlap="1">
+                    <wp:anchor distT="635" distB="635" distL="635" distR="635" simplePos="0" relativeHeight="6" behindDoc="1" locked="0" layoutInCell="1" allowOverlap="1">
                       <wp:simplePos x="0" y="0"/>
                       <wp:positionH relativeFrom="column">
                         <wp:posOffset>455930</wp:posOffset>
@@ -3229,7 +3365,7 @@
                 </mc:Fallback>
               </mc:AlternateContent>
               <w:drawing>
-                <wp:anchor distT="0" distB="0" distL="0" distR="0" simplePos="0" relativeHeight="7" behindDoc="0" locked="0" layoutInCell="1" allowOverlap="1">
+                <wp:anchor distT="0" distB="0" distL="0" distR="0" simplePos="0" relativeHeight="9" behindDoc="0" locked="0" layoutInCell="1" allowOverlap="1">
                   <wp:simplePos x="0" y="0"/>
                   <wp:positionH relativeFrom="column">
                     <wp:posOffset>1344295</wp:posOffset>
@@ -3277,10 +3413,10 @@
               <mc:AlternateContent>
                 <mc:Choice Requires="wps">
                   <w:drawing>
-                    <wp:anchor distT="1905" distB="635" distL="1270" distR="1270" simplePos="0" relativeHeight="9" behindDoc="0" locked="0" layoutInCell="1" allowOverlap="1">
+                    <wp:anchor distT="1905" distB="635" distL="1270" distR="1270" simplePos="0" relativeHeight="11" behindDoc="0" locked="0" layoutInCell="1" allowOverlap="1">
                       <wp:simplePos x="0" y="0"/>
                       <wp:positionH relativeFrom="column">
-                        <wp:posOffset>-45979715</wp:posOffset>
+                        <wp:posOffset>-1385069620</wp:posOffset>
                       </wp:positionH>
                       <wp:positionV relativeFrom="paragraph">
                         <wp:posOffset>47625</wp:posOffset>
@@ -3327,7 +3463,7 @@
                 </mc:Choice>
                 <mc:Fallback>
                   <w:pict>
-                    <v:roundrect id="shape_0" fillcolor="white" stroked="t" o:allowincell="t" style="position:absolute;margin-left:-3620.45pt;margin-top:3.75pt;width:11.2pt;height:9.7pt;mso-wrap-style:none;v-text-anchor:middle">
+                    <v:roundrect id="shape_0" fillcolor="white" stroked="t" o:allowincell="t" style="position:absolute;margin-left:-109060.6pt;margin-top:3.75pt;width:11.2pt;height:9.7pt;mso-wrap-style:none;v-text-anchor:middle">
                       <v:fill o:detectmouseclick="t" type="solid" color2="black"/>
                       <v:stroke color="black" joinstyle="round" endcap="flat"/>
                       <w10:wrap type="none"/>
@@ -3425,11 +3561,11 @@
         <w:tblLook w:noHBand="0" w:noVBand="1" w:firstColumn="1" w:lastRow="0" w:lastColumn="0" w:firstRow="1" w:val="04a0"/>
       </w:tblPr>
       <w:tblGrid>
-        <w:gridCol w:w="112"/>
-        <w:gridCol w:w="1233"/>
-        <w:gridCol w:w="3587"/>
+        <w:gridCol w:w="111"/>
+        <w:gridCol w:w="1234"/>
+        <w:gridCol w:w="3586"/>
         <w:gridCol w:w="2008"/>
-        <w:gridCol w:w="2639"/>
+        <w:gridCol w:w="2640"/>
         <w:gridCol w:w="318"/>
       </w:tblGrid>
       <w:tr>
@@ -3479,7 +3615,7 @@
         </w:tc>
         <w:tc>
           <w:tcPr>
-            <w:tcW w:w="3587" w:type="dxa"/>
+            <w:tcW w:w="3586" w:type="dxa"/>
             <w:tcBorders/>
           </w:tcPr>
           <w:p>
@@ -3528,7 +3664,7 @@
         </w:tc>
         <w:tc>
           <w:tcPr>
-            <w:tcW w:w="2639" w:type="dxa"/>
+            <w:tcW w:w="2640" w:type="dxa"/>
             <w:tcBorders/>
           </w:tcPr>
           <w:p>
@@ -3585,7 +3721,7 @@
         </w:trPr>
         <w:tc>
           <w:tcPr>
-            <w:tcW w:w="112" w:type="dxa"/>
+            <w:tcW w:w="111" w:type="dxa"/>
             <w:tcBorders/>
           </w:tcPr>
           <w:p>
@@ -3679,7 +3815,7 @@
         </w:tc>
         <w:tc>
           <w:tcPr>
-            <w:tcW w:w="4965" w:type="dxa"/>
+            <w:tcW w:w="4966" w:type="dxa"/>
             <w:gridSpan w:val="3"/>
             <w:tcBorders>
               <w:top w:val="single" w:sz="4" w:space="0" w:color="000000"/>
@@ -3719,7 +3855,7 @@
         </w:trPr>
         <w:tc>
           <w:tcPr>
-            <w:tcW w:w="112" w:type="dxa"/>
+            <w:tcW w:w="111" w:type="dxa"/>
             <w:tcBorders/>
           </w:tcPr>
           <w:p>
@@ -3786,7 +3922,7 @@
         </w:tc>
         <w:tc>
           <w:tcPr>
-            <w:tcW w:w="4965" w:type="dxa"/>
+            <w:tcW w:w="4966" w:type="dxa"/>
             <w:gridSpan w:val="3"/>
             <w:tcBorders>
               <w:top w:val="single" w:sz="4" w:space="0" w:color="000000"/>
@@ -3828,7 +3964,7 @@
         </w:trPr>
         <w:tc>
           <w:tcPr>
-            <w:tcW w:w="112" w:type="dxa"/>
+            <w:tcW w:w="111" w:type="dxa"/>
             <w:tcBorders/>
           </w:tcPr>
           <w:p>
@@ -3895,7 +4031,7 @@
         </w:tc>
         <w:tc>
           <w:tcPr>
-            <w:tcW w:w="4965" w:type="dxa"/>
+            <w:tcW w:w="4966" w:type="dxa"/>
             <w:gridSpan w:val="3"/>
             <w:tcBorders>
               <w:top w:val="single" w:sz="4" w:space="0" w:color="000000"/>
@@ -3937,7 +4073,7 @@
         </w:trPr>
         <w:tc>
           <w:tcPr>
-            <w:tcW w:w="112" w:type="dxa"/>
+            <w:tcW w:w="111" w:type="dxa"/>
             <w:tcBorders/>
           </w:tcPr>
           <w:p>
@@ -4004,7 +4140,7 @@
         </w:tc>
         <w:tc>
           <w:tcPr>
-            <w:tcW w:w="4965" w:type="dxa"/>
+            <w:tcW w:w="4966" w:type="dxa"/>
             <w:gridSpan w:val="3"/>
             <w:tcBorders>
               <w:top w:val="single" w:sz="4" w:space="0" w:color="000000"/>
@@ -4046,7 +4182,7 @@
         </w:trPr>
         <w:tc>
           <w:tcPr>
-            <w:tcW w:w="112" w:type="dxa"/>
+            <w:tcW w:w="111" w:type="dxa"/>
             <w:tcBorders/>
           </w:tcPr>
           <w:p>
@@ -4113,7 +4249,7 @@
         </w:tc>
         <w:tc>
           <w:tcPr>
-            <w:tcW w:w="4965" w:type="dxa"/>
+            <w:tcW w:w="4966" w:type="dxa"/>
             <w:gridSpan w:val="3"/>
             <w:tcBorders>
               <w:top w:val="single" w:sz="4" w:space="0" w:color="000000"/>
@@ -4221,8 +4357,8 @@
     <w:tblGrid>
       <w:gridCol w:w="1181"/>
       <w:gridCol w:w="3280"/>
-      <w:gridCol w:w="4767"/>
-      <w:gridCol w:w="1572"/>
+      <w:gridCol w:w="4766"/>
+      <w:gridCol w:w="1573"/>
     </w:tblGrid>
     <w:tr>
       <w:trPr>
@@ -4426,7 +4562,7 @@
       </w:tc>
       <w:tc>
         <w:tcPr>
-          <w:tcW w:w="4767" w:type="dxa"/>
+          <w:tcW w:w="4766" w:type="dxa"/>
           <w:tcBorders/>
         </w:tcPr>
         <w:p>
@@ -4511,7 +4647,7 @@
       </w:tc>
       <w:tc>
         <w:tcPr>
-          <w:tcW w:w="1572" w:type="dxa"/>
+          <w:tcW w:w="1573" w:type="dxa"/>
           <w:tcBorders/>
           <w:vAlign w:val="center"/>
         </w:tcPr>
@@ -4602,8 +4738,8 @@
     <w:tblGrid>
       <w:gridCol w:w="1181"/>
       <w:gridCol w:w="3280"/>
-      <w:gridCol w:w="4767"/>
-      <w:gridCol w:w="1572"/>
+      <w:gridCol w:w="4766"/>
+      <w:gridCol w:w="1573"/>
     </w:tblGrid>
     <w:tr>
       <w:trPr>
@@ -4807,7 +4943,7 @@
       </w:tc>
       <w:tc>
         <w:tcPr>
-          <w:tcW w:w="4767" w:type="dxa"/>
+          <w:tcW w:w="4766" w:type="dxa"/>
           <w:tcBorders/>
         </w:tcPr>
         <w:p>
@@ -4892,7 +5028,7 @@
       </w:tc>
       <w:tc>
         <w:tcPr>
-          <w:tcW w:w="1572" w:type="dxa"/>
+          <w:tcW w:w="1573" w:type="dxa"/>
           <w:tcBorders/>
           <w:vAlign w:val="center"/>
         </w:tcPr>
@@ -5449,16 +5585,16 @@
       <w:lang w:val="en-US" w:eastAsia="en-US"/>
     </w:rPr>
   </w:style>
-  <w:style w:type="character" w:styleId="FootnoteCharacters">
-    <w:name w:val="Footnote Characters"/>
+  <w:style w:type="character" w:styleId="FootnoteCharactersuser">
+    <w:name w:val="Footnote Characters (user)"/>
     <w:qFormat/>
     <w:rsid w:val="000b1fa2"/>
     <w:rPr>
       <w:vertAlign w:val="superscript"/>
     </w:rPr>
   </w:style>
-  <w:style w:type="character" w:styleId="FootnoteCharactersuser">
-    <w:name w:val="Footnote Characters (user)"/>
+  <w:style w:type="character" w:styleId="FootnoteCharacters">
+    <w:name w:val="Footnote Characters"/>
     <w:qFormat/>
     <w:rPr>
       <w:vertAlign w:val="superscript"/>

</xml_diff>

<commit_message>
feat: add student card & new checkbox for dep manager
</commit_message>
<xml_diff>
--- a/backend/scripts/supervisor-request-empty.docx
+++ b/backend/scripts/supervisor-request-empty.docx
@@ -376,6 +376,8 @@
           <w:p>
             <w:pPr>
               <w:pStyle w:val="Normal"/>
+              <w:bidi w:val="1"/>
+              <w:jc w:val="left"/>
               <w:rPr/>
             </w:pPr>
             <w:r>
@@ -425,8 +427,8 @@
         <w:tblLook w:noHBand="0" w:noVBand="1" w:firstColumn="1" w:lastRow="0" w:lastColumn="0" w:firstRow="1" w:val="04a0"/>
       </w:tblPr>
       <w:tblGrid>
-        <w:gridCol w:w="2517"/>
-        <w:gridCol w:w="7380"/>
+        <w:gridCol w:w="2515"/>
+        <w:gridCol w:w="7382"/>
       </w:tblGrid>
       <w:tr>
         <w:trPr>
@@ -434,7 +436,7 @@
         </w:trPr>
         <w:tc>
           <w:tcPr>
-            <w:tcW w:w="2517" w:type="dxa"/>
+            <w:tcW w:w="2515" w:type="dxa"/>
             <w:tcBorders>
               <w:right w:val="single" w:sz="4" w:space="0" w:color="000000"/>
             </w:tcBorders>
@@ -501,7 +503,7 @@
         </w:tc>
         <w:tc>
           <w:tcPr>
-            <w:tcW w:w="7380" w:type="dxa"/>
+            <w:tcW w:w="7382" w:type="dxa"/>
             <w:tcBorders>
               <w:top w:val="single" w:sz="4" w:space="0" w:color="000000"/>
               <w:left w:val="single" w:sz="4" w:space="0" w:color="000000"/>
@@ -574,11 +576,11 @@
       </w:tblPr>
       <w:tblGrid>
         <w:gridCol w:w="1345"/>
-        <w:gridCol w:w="1743"/>
+        <w:gridCol w:w="1741"/>
         <w:gridCol w:w="2513"/>
-        <w:gridCol w:w="634"/>
-        <w:gridCol w:w="2156"/>
-        <w:gridCol w:w="1506"/>
+        <w:gridCol w:w="636"/>
+        <w:gridCol w:w="2154"/>
+        <w:gridCol w:w="1508"/>
       </w:tblGrid>
       <w:tr>
         <w:trPr>
@@ -628,7 +630,7 @@
         </w:tc>
         <w:tc>
           <w:tcPr>
-            <w:tcW w:w="1743" w:type="dxa"/>
+            <w:tcW w:w="1741" w:type="dxa"/>
             <w:tcBorders>
               <w:top w:val="single" w:sz="4" w:space="0" w:color="000000"/>
               <w:left w:val="single" w:sz="4" w:space="0" w:color="000000"/>
@@ -721,7 +723,7 @@
         </w:tc>
         <w:tc>
           <w:tcPr>
-            <w:tcW w:w="634" w:type="dxa"/>
+            <w:tcW w:w="636" w:type="dxa"/>
             <w:tcBorders>
               <w:top w:val="single" w:sz="4" w:space="0" w:color="000000"/>
               <w:left w:val="single" w:sz="4" w:space="0" w:color="000000"/>
@@ -759,7 +761,7 @@
         </w:tc>
         <w:tc>
           <w:tcPr>
-            <w:tcW w:w="2156" w:type="dxa"/>
+            <w:tcW w:w="2154" w:type="dxa"/>
             <w:tcBorders>
               <w:left w:val="single" w:sz="4" w:space="0" w:color="000000"/>
               <w:right w:val="single" w:sz="4" w:space="0" w:color="000000"/>
@@ -849,7 +851,7 @@
         </w:tc>
         <w:tc>
           <w:tcPr>
-            <w:tcW w:w="1506" w:type="dxa"/>
+            <w:tcW w:w="1508" w:type="dxa"/>
             <w:tcBorders>
               <w:top w:val="single" w:sz="4" w:space="0" w:color="000000"/>
               <w:left w:val="single" w:sz="4" w:space="0" w:color="000000"/>
@@ -928,11 +930,11 @@
         <w:tblLook w:noHBand="0" w:noVBand="1" w:firstColumn="1" w:lastRow="0" w:lastColumn="0" w:firstRow="1" w:val="04a0"/>
       </w:tblPr>
       <w:tblGrid>
-        <w:gridCol w:w="111"/>
-        <w:gridCol w:w="1563"/>
-        <w:gridCol w:w="3193"/>
+        <w:gridCol w:w="109"/>
+        <w:gridCol w:w="1565"/>
+        <w:gridCol w:w="3191"/>
         <w:gridCol w:w="347"/>
-        <w:gridCol w:w="2058"/>
+        <w:gridCol w:w="2060"/>
         <w:gridCol w:w="2625"/>
         <w:gridCol w:w="11"/>
       </w:tblGrid>
@@ -983,7 +985,7 @@
         </w:tc>
         <w:tc>
           <w:tcPr>
-            <w:tcW w:w="3193" w:type="dxa"/>
+            <w:tcW w:w="3191" w:type="dxa"/>
             <w:tcBorders/>
           </w:tcPr>
           <w:p>
@@ -1012,7 +1014,7 @@
         </w:tc>
         <w:tc>
           <w:tcPr>
-            <w:tcW w:w="2405" w:type="dxa"/>
+            <w:tcW w:w="2407" w:type="dxa"/>
             <w:gridSpan w:val="2"/>
             <w:tcBorders/>
           </w:tcPr>
@@ -1068,7 +1070,7 @@
         </w:trPr>
         <w:tc>
           <w:tcPr>
-            <w:tcW w:w="111" w:type="dxa"/>
+            <w:tcW w:w="109" w:type="dxa"/>
             <w:tcBorders/>
           </w:tcPr>
           <w:p>
@@ -1162,7 +1164,7 @@
         </w:tc>
         <w:tc>
           <w:tcPr>
-            <w:tcW w:w="4683" w:type="dxa"/>
+            <w:tcW w:w="4685" w:type="dxa"/>
             <w:gridSpan w:val="2"/>
             <w:tcBorders>
               <w:top w:val="single" w:sz="4" w:space="0" w:color="000000"/>
@@ -1246,12 +1248,12 @@
       </w:tr>
       <w:tr>
         <w:trPr>
-          <w:trHeight w:val="340" w:hRule="atLeast"/>
+          <w:trHeight w:val="478" w:hRule="atLeast"/>
           <w:cantSplit/>
         </w:trPr>
         <w:tc>
           <w:tcPr>
-            <w:tcW w:w="111" w:type="dxa"/>
+            <w:tcW w:w="109" w:type="dxa"/>
             <w:tcBorders/>
           </w:tcPr>
           <w:p>
@@ -1318,7 +1320,7 @@
         </w:tc>
         <w:tc>
           <w:tcPr>
-            <w:tcW w:w="4683" w:type="dxa"/>
+            <w:tcW w:w="4685" w:type="dxa"/>
             <w:gridSpan w:val="2"/>
             <w:tcBorders>
               <w:top w:val="single" w:sz="4" w:space="0" w:color="000000"/>
@@ -1384,7 +1386,7 @@
         </w:trPr>
         <w:tc>
           <w:tcPr>
-            <w:tcW w:w="111" w:type="dxa"/>
+            <w:tcW w:w="109" w:type="dxa"/>
             <w:tcBorders/>
           </w:tcPr>
           <w:p>
@@ -1451,7 +1453,7 @@
         </w:tc>
         <w:tc>
           <w:tcPr>
-            <w:tcW w:w="4683" w:type="dxa"/>
+            <w:tcW w:w="4685" w:type="dxa"/>
             <w:gridSpan w:val="2"/>
             <w:tcBorders>
               <w:top w:val="single" w:sz="4" w:space="0" w:color="000000"/>
@@ -1517,7 +1519,7 @@
         </w:trPr>
         <w:tc>
           <w:tcPr>
-            <w:tcW w:w="111" w:type="dxa"/>
+            <w:tcW w:w="109" w:type="dxa"/>
             <w:tcBorders/>
           </w:tcPr>
           <w:p>
@@ -1584,7 +1586,7 @@
         </w:tc>
         <w:tc>
           <w:tcPr>
-            <w:tcW w:w="4683" w:type="dxa"/>
+            <w:tcW w:w="4685" w:type="dxa"/>
             <w:gridSpan w:val="2"/>
             <w:tcBorders>
               <w:top w:val="single" w:sz="4" w:space="0" w:color="000000"/>
@@ -1650,7 +1652,7 @@
         </w:trPr>
         <w:tc>
           <w:tcPr>
-            <w:tcW w:w="111" w:type="dxa"/>
+            <w:tcW w:w="109" w:type="dxa"/>
             <w:tcBorders/>
           </w:tcPr>
           <w:p>
@@ -1717,7 +1719,7 @@
         </w:tc>
         <w:tc>
           <w:tcPr>
-            <w:tcW w:w="4683" w:type="dxa"/>
+            <w:tcW w:w="4685" w:type="dxa"/>
             <w:gridSpan w:val="2"/>
             <w:tcBorders>
               <w:top w:val="single" w:sz="4" w:space="0" w:color="000000"/>
@@ -2009,10 +2011,10 @@
       </w:tblPr>
       <w:tblGrid>
         <w:gridCol w:w="1816"/>
-        <w:gridCol w:w="1555"/>
-        <w:gridCol w:w="1781"/>
-        <w:gridCol w:w="1480"/>
-        <w:gridCol w:w="3265"/>
+        <w:gridCol w:w="1553"/>
+        <w:gridCol w:w="1783"/>
+        <w:gridCol w:w="1478"/>
+        <w:gridCol w:w="3267"/>
       </w:tblGrid>
       <w:tr>
         <w:trPr>
@@ -2252,7 +2254,7 @@
         </w:tc>
         <w:tc>
           <w:tcPr>
-            <w:tcW w:w="1555" w:type="dxa"/>
+            <w:tcW w:w="1553" w:type="dxa"/>
             <w:tcBorders>
               <w:top w:val="single" w:sz="4" w:space="0" w:color="000000"/>
               <w:left w:val="single" w:sz="4" w:space="0" w:color="000000"/>
@@ -2298,7 +2300,7 @@
         </w:tc>
         <w:tc>
           <w:tcPr>
-            <w:tcW w:w="1781" w:type="dxa"/>
+            <w:tcW w:w="1783" w:type="dxa"/>
             <w:tcBorders>
               <w:top w:val="single" w:sz="4" w:space="0" w:color="000000"/>
               <w:left w:val="single" w:sz="4" w:space="0" w:color="000000"/>
@@ -2344,7 +2346,7 @@
         </w:tc>
         <w:tc>
           <w:tcPr>
-            <w:tcW w:w="1480" w:type="dxa"/>
+            <w:tcW w:w="1478" w:type="dxa"/>
             <w:tcBorders>
               <w:top w:val="single" w:sz="4" w:space="0" w:color="000000"/>
               <w:left w:val="single" w:sz="4" w:space="0" w:color="000000"/>
@@ -2390,7 +2392,7 @@
         </w:tc>
         <w:tc>
           <w:tcPr>
-            <w:tcW w:w="3265" w:type="dxa"/>
+            <w:tcW w:w="3267" w:type="dxa"/>
             <w:tcBorders>
               <w:top w:val="single" w:sz="4" w:space="0" w:color="000000"/>
               <w:left w:val="single" w:sz="4" w:space="0" w:color="000000"/>
@@ -2474,7 +2476,7 @@
         </w:tc>
         <w:tc>
           <w:tcPr>
-            <w:tcW w:w="1555" w:type="dxa"/>
+            <w:tcW w:w="1553" w:type="dxa"/>
             <w:tcBorders>
               <w:top w:val="single" w:sz="4" w:space="0" w:color="000000"/>
               <w:left w:val="single" w:sz="4" w:space="0" w:color="000000"/>
@@ -2504,7 +2506,7 @@
         </w:tc>
         <w:tc>
           <w:tcPr>
-            <w:tcW w:w="1781" w:type="dxa"/>
+            <w:tcW w:w="1783" w:type="dxa"/>
             <w:tcBorders>
               <w:top w:val="single" w:sz="4" w:space="0" w:color="000000"/>
               <w:left w:val="single" w:sz="4" w:space="0" w:color="000000"/>
@@ -2538,7 +2540,7 @@
         </w:tc>
         <w:tc>
           <w:tcPr>
-            <w:tcW w:w="1480" w:type="dxa"/>
+            <w:tcW w:w="1478" w:type="dxa"/>
             <w:tcBorders>
               <w:top w:val="single" w:sz="4" w:space="0" w:color="000000"/>
               <w:left w:val="single" w:sz="4" w:space="0" w:color="000000"/>
@@ -2572,7 +2574,7 @@
         </w:tc>
         <w:tc>
           <w:tcPr>
-            <w:tcW w:w="3265" w:type="dxa"/>
+            <w:tcW w:w="3267" w:type="dxa"/>
             <w:tcBorders>
               <w:top w:val="single" w:sz="4" w:space="0" w:color="000000"/>
               <w:left w:val="single" w:sz="4" w:space="0" w:color="000000"/>
@@ -2656,8 +2658,8 @@
         <w:tblLook w:noHBand="0" w:noVBand="1" w:firstColumn="1" w:lastRow="0" w:lastColumn="0" w:firstRow="1" w:val="04a0"/>
       </w:tblPr>
       <w:tblGrid>
-        <w:gridCol w:w="3965"/>
-        <w:gridCol w:w="3123"/>
+        <w:gridCol w:w="3963"/>
+        <w:gridCol w:w="3125"/>
         <w:gridCol w:w="2694"/>
       </w:tblGrid>
       <w:tr>
@@ -2666,7 +2668,7 @@
         </w:trPr>
         <w:tc>
           <w:tcPr>
-            <w:tcW w:w="3965" w:type="dxa"/>
+            <w:tcW w:w="3963" w:type="dxa"/>
             <w:tcBorders>
               <w:top w:val="single" w:sz="4" w:space="0" w:color="000000"/>
               <w:left w:val="single" w:sz="4" w:space="0" w:color="000000"/>
@@ -2726,7 +2728,7 @@
         </w:tc>
         <w:tc>
           <w:tcPr>
-            <w:tcW w:w="3123" w:type="dxa"/>
+            <w:tcW w:w="3125" w:type="dxa"/>
             <w:tcBorders>
               <w:top w:val="single" w:sz="4" w:space="0" w:color="000000"/>
               <w:left w:val="single" w:sz="4" w:space="0" w:color="000000"/>
@@ -2881,11 +2883,11 @@
       </w:tr>
       <w:tr>
         <w:trPr>
-          <w:trHeight w:val="380" w:hRule="atLeast"/>
+          <w:trHeight w:val="641" w:hRule="atLeast"/>
         </w:trPr>
         <w:tc>
           <w:tcPr>
-            <w:tcW w:w="3965" w:type="dxa"/>
+            <w:tcW w:w="3963" w:type="dxa"/>
             <w:tcBorders>
               <w:top w:val="single" w:sz="4" w:space="0" w:color="000000"/>
               <w:left w:val="single" w:sz="4" w:space="0" w:color="000000"/>
@@ -2920,7 +2922,7 @@
         </w:tc>
         <w:tc>
           <w:tcPr>
-            <w:tcW w:w="3123" w:type="dxa"/>
+            <w:tcW w:w="3125" w:type="dxa"/>
             <w:tcBorders>
               <w:top w:val="single" w:sz="4" w:space="0" w:color="000000"/>
               <w:left w:val="single" w:sz="4" w:space="0" w:color="000000"/>
@@ -3071,7 +3073,7 @@
                     <wp:anchor distT="1905" distB="635" distL="1270" distR="1270" simplePos="0" relativeHeight="10" behindDoc="0" locked="0" layoutInCell="1" allowOverlap="1">
                       <wp:simplePos x="0" y="0"/>
                       <wp:positionH relativeFrom="column">
-                        <wp:posOffset>-1385069620</wp:posOffset>
+                        <wp:posOffset>-2147483648</wp:posOffset>
                       </wp:positionH>
                       <wp:positionV relativeFrom="paragraph">
                         <wp:posOffset>47625</wp:posOffset>
@@ -3118,7 +3120,7 @@
                 </mc:Choice>
                 <mc:Fallback>
                   <w:pict>
-                    <v:roundrect id="shape_0" fillcolor="white" stroked="t" o:allowincell="t" style="position:absolute;margin-left:-109060.6pt;margin-top:3.75pt;width:11.2pt;height:9.7pt;mso-wrap-style:none;v-text-anchor:middle">
+                    <v:roundrect id="shape_0" fillcolor="white" stroked="t" o:allowincell="t" style="position:absolute;margin-left:-676015.7pt;margin-top:3.75pt;width:11.2pt;height:9.7pt;mso-wrap-style:none;v-text-anchor:middle">
                       <v:fill o:detectmouseclick="t" type="solid" color2="black"/>
                       <v:stroke color="black" joinstyle="round" endcap="flat"/>
                       <w10:wrap type="none"/>
@@ -3179,7 +3181,7 @@
                 </mc:Choice>
                 <mc:Fallback>
                   <w:pict>
-                    <v:roundrect id="shape_0" fillcolor="white" stroked="t" o:allowincell="t" style="position:absolute;margin-left:-235222.3pt;margin-top:21.15pt;width:16.1pt;height:13.25pt;mso-wrap-style:none;v-text-anchor:middle">
+                    <v:roundrect id="shape_0" fillcolor="white" stroked="t" o:allowincell="t" style="position:absolute;margin-left:-676001pt;margin-top:21.15pt;width:16.1pt;height:13.25pt;mso-wrap-style:none;v-text-anchor:middle">
                       <v:fill o:detectmouseclick="t" type="solid" color2="black"/>
                       <v:stroke color="black" joinstyle="round" endcap="flat"/>
                       <w10:wrap type="none"/>
@@ -3217,7 +3219,7 @@
         </w:trPr>
         <w:tc>
           <w:tcPr>
-            <w:tcW w:w="3965" w:type="dxa"/>
+            <w:tcW w:w="3963" w:type="dxa"/>
             <w:tcBorders>
               <w:top w:val="single" w:sz="4" w:space="0" w:color="000000"/>
               <w:left w:val="single" w:sz="4" w:space="0" w:color="000000"/>
@@ -3252,7 +3254,7 @@
         </w:tc>
         <w:tc>
           <w:tcPr>
-            <w:tcW w:w="3123" w:type="dxa"/>
+            <w:tcW w:w="3125" w:type="dxa"/>
             <w:tcBorders>
               <w:top w:val="single" w:sz="4" w:space="0" w:color="000000"/>
               <w:left w:val="single" w:sz="4" w:space="0" w:color="000000"/>
@@ -3416,7 +3418,7 @@
                     <wp:anchor distT="1905" distB="635" distL="1270" distR="1270" simplePos="0" relativeHeight="11" behindDoc="0" locked="0" layoutInCell="1" allowOverlap="1">
                       <wp:simplePos x="0" y="0"/>
                       <wp:positionH relativeFrom="column">
-                        <wp:posOffset>-1385069620</wp:posOffset>
+                        <wp:posOffset>-2147483648</wp:posOffset>
                       </wp:positionH>
                       <wp:positionV relativeFrom="paragraph">
                         <wp:posOffset>47625</wp:posOffset>
@@ -3463,7 +3465,7 @@
                 </mc:Choice>
                 <mc:Fallback>
                   <w:pict>
-                    <v:roundrect id="shape_0" fillcolor="white" stroked="t" o:allowincell="t" style="position:absolute;margin-left:-109060.6pt;margin-top:3.75pt;width:11.2pt;height:9.7pt;mso-wrap-style:none;v-text-anchor:middle">
+                    <v:roundrect id="shape_0" fillcolor="white" stroked="t" o:allowincell="t" style="position:absolute;margin-left:-676015.7pt;margin-top:3.75pt;width:11.2pt;height:9.7pt;mso-wrap-style:none;v-text-anchor:middle">
                       <v:fill o:detectmouseclick="t" type="solid" color2="black"/>
                       <v:stroke color="black" joinstyle="round" endcap="flat"/>
                       <w10:wrap type="none"/>
@@ -3561,11 +3563,11 @@
         <w:tblLook w:noHBand="0" w:noVBand="1" w:firstColumn="1" w:lastRow="0" w:lastColumn="0" w:firstRow="1" w:val="04a0"/>
       </w:tblPr>
       <w:tblGrid>
-        <w:gridCol w:w="111"/>
-        <w:gridCol w:w="1234"/>
-        <w:gridCol w:w="3586"/>
+        <w:gridCol w:w="109"/>
+        <w:gridCol w:w="1236"/>
+        <w:gridCol w:w="3584"/>
         <w:gridCol w:w="2008"/>
-        <w:gridCol w:w="2640"/>
+        <w:gridCol w:w="2642"/>
         <w:gridCol w:w="318"/>
       </w:tblGrid>
       <w:tr>
@@ -3615,7 +3617,7 @@
         </w:tc>
         <w:tc>
           <w:tcPr>
-            <w:tcW w:w="3586" w:type="dxa"/>
+            <w:tcW w:w="3584" w:type="dxa"/>
             <w:tcBorders/>
           </w:tcPr>
           <w:p>
@@ -3664,7 +3666,7 @@
         </w:tc>
         <w:tc>
           <w:tcPr>
-            <w:tcW w:w="2640" w:type="dxa"/>
+            <w:tcW w:w="2642" w:type="dxa"/>
             <w:tcBorders/>
           </w:tcPr>
           <w:p>
@@ -3721,7 +3723,7 @@
         </w:trPr>
         <w:tc>
           <w:tcPr>
-            <w:tcW w:w="111" w:type="dxa"/>
+            <w:tcW w:w="109" w:type="dxa"/>
             <w:tcBorders/>
           </w:tcPr>
           <w:p>
@@ -3815,7 +3817,7 @@
         </w:tc>
         <w:tc>
           <w:tcPr>
-            <w:tcW w:w="4966" w:type="dxa"/>
+            <w:tcW w:w="4968" w:type="dxa"/>
             <w:gridSpan w:val="3"/>
             <w:tcBorders>
               <w:top w:val="single" w:sz="4" w:space="0" w:color="000000"/>
@@ -3851,11 +3853,11 @@
       </w:tr>
       <w:tr>
         <w:trPr>
-          <w:trHeight w:val="340" w:hRule="atLeast"/>
+          <w:trHeight w:val="564" w:hRule="atLeast"/>
         </w:trPr>
         <w:tc>
           <w:tcPr>
-            <w:tcW w:w="111" w:type="dxa"/>
+            <w:tcW w:w="109" w:type="dxa"/>
             <w:tcBorders/>
           </w:tcPr>
           <w:p>
@@ -3922,7 +3924,7 @@
         </w:tc>
         <w:tc>
           <w:tcPr>
-            <w:tcW w:w="4966" w:type="dxa"/>
+            <w:tcW w:w="4968" w:type="dxa"/>
             <w:gridSpan w:val="3"/>
             <w:tcBorders>
               <w:top w:val="single" w:sz="4" w:space="0" w:color="000000"/>
@@ -3964,7 +3966,7 @@
         </w:trPr>
         <w:tc>
           <w:tcPr>
-            <w:tcW w:w="111" w:type="dxa"/>
+            <w:tcW w:w="109" w:type="dxa"/>
             <w:tcBorders/>
           </w:tcPr>
           <w:p>
@@ -4031,7 +4033,7 @@
         </w:tc>
         <w:tc>
           <w:tcPr>
-            <w:tcW w:w="4966" w:type="dxa"/>
+            <w:tcW w:w="4968" w:type="dxa"/>
             <w:gridSpan w:val="3"/>
             <w:tcBorders>
               <w:top w:val="single" w:sz="4" w:space="0" w:color="000000"/>
@@ -4073,7 +4075,7 @@
         </w:trPr>
         <w:tc>
           <w:tcPr>
-            <w:tcW w:w="111" w:type="dxa"/>
+            <w:tcW w:w="109" w:type="dxa"/>
             <w:tcBorders/>
           </w:tcPr>
           <w:p>
@@ -4140,7 +4142,7 @@
         </w:tc>
         <w:tc>
           <w:tcPr>
-            <w:tcW w:w="4966" w:type="dxa"/>
+            <w:tcW w:w="4968" w:type="dxa"/>
             <w:gridSpan w:val="3"/>
             <w:tcBorders>
               <w:top w:val="single" w:sz="4" w:space="0" w:color="000000"/>
@@ -4182,7 +4184,7 @@
         </w:trPr>
         <w:tc>
           <w:tcPr>
-            <w:tcW w:w="111" w:type="dxa"/>
+            <w:tcW w:w="109" w:type="dxa"/>
             <w:tcBorders/>
           </w:tcPr>
           <w:p>
@@ -4249,7 +4251,7 @@
         </w:tc>
         <w:tc>
           <w:tcPr>
-            <w:tcW w:w="4966" w:type="dxa"/>
+            <w:tcW w:w="4968" w:type="dxa"/>
             <w:gridSpan w:val="3"/>
             <w:tcBorders>
               <w:top w:val="single" w:sz="4" w:space="0" w:color="000000"/>

</xml_diff>